<commit_message>
Fixed FDR corrections and upset plot
</commit_message>
<xml_diff>
--- a/results/Aim1/tables/s_table4_lme_main.docx
+++ b/results/Aim1/tables/s_table4_lme_main.docx
@@ -283,6 +283,21 @@
               <w:bottom w:val="single" w:sz="16" w:space="0" w:color="D3D3D3"/>
             </w:tcBorders>
           </w:tcPr>
+          <w:p>
+            <w:pPr>
+              <w:spacing w:before="0" w:after="60"/>
+              <w:keepNext/>
+              <w:jc w:val="center"/>
+            </w:pPr>
+            <w:r>
+              <w:rPr>
+                <w:b w:val="true"/>
+                <w:rFonts w:ascii="Calibri" w:hAnsi="Calibri"/>
+                <w:sz w:val="20"/>
+              </w:rPr>
+              <w:t xml:space="preserve">q</w:t>
+            </w:r>
+          </w:p>
         </w:tc>
         <w:tc>
           <w:tcPr>
@@ -357,6 +372,21 @@
               <w:end w:val="single" w:space="0" w:color="D3D3D3"/>
             </w:tcBorders>
           </w:tcPr>
+          <w:p>
+            <w:pPr>
+              <w:spacing w:before="0" w:after="60"/>
+              <w:keepNext/>
+              <w:jc w:val="center"/>
+            </w:pPr>
+            <w:r>
+              <w:rPr>
+                <w:b w:val="true"/>
+                <w:rFonts w:ascii="Calibri" w:hAnsi="Calibri"/>
+                <w:sz w:val="20"/>
+              </w:rPr>
+              <w:t xml:space="preserve">q</w:t>
+            </w:r>
+          </w:p>
         </w:tc>
       </w:tr>
       <w:tr>
@@ -502,19 +532,20 @@
               <w:start w:val="single" w:space="0" w:color="D3D3D3"/>
               <w:end w:val="single" w:space="0" w:color="D3D3D3"/>
             </w:tcBorders>
-          </w:tcPr>
-          <w:p>
-            <w:pPr>
-              <w:spacing w:before="0" w:after="60"/>
-              <w:keepNext/>
-              <w:jc w:val="center"/>
-            </w:pPr>
-            <w:r>
-              <w:rPr>
-                <w:rFonts w:ascii="Calibri" w:hAnsi="Calibri"/>
-                <w:sz w:val="20"/>
-              </w:rPr>
-              <w:t xml:space="default">***</w:t>
+            <w:shd w:val="clear" w:color="auto" w:fill="C8E6C9"/>
+          </w:tcPr>
+          <w:p>
+            <w:pPr>
+              <w:spacing w:before="0" w:after="60"/>
+              <w:keepNext/>
+              <w:jc w:val="center"/>
+            </w:pPr>
+            <w:r>
+              <w:rPr>
+                <w:rFonts w:ascii="Calibri" w:hAnsi="Calibri"/>
+                <w:sz w:val="20"/>
+              </w:rPr>
+              <w:t xml:space="default">&lt;0.001</w:t>
             </w:r>
           </w:p>
         </w:tc>
@@ -599,19 +630,20 @@
               <w:start w:val="single" w:space="0" w:color="D3D3D3"/>
               <w:end w:val="single" w:space="0" w:color="D3D3D3"/>
             </w:tcBorders>
-          </w:tcPr>
-          <w:p>
-            <w:pPr>
-              <w:spacing w:before="0" w:after="60"/>
-              <w:keepNext/>
-              <w:jc w:val="center"/>
-            </w:pPr>
-            <w:r>
-              <w:rPr>
-                <w:rFonts w:ascii="Calibri" w:hAnsi="Calibri"/>
-                <w:sz w:val="20"/>
-              </w:rPr>
-              <w:t xml:space="default">**</w:t>
+            <w:shd w:val="clear" w:color="auto" w:fill="C8E6C9"/>
+          </w:tcPr>
+          <w:p>
+            <w:pPr>
+              <w:spacing w:before="0" w:after="60"/>
+              <w:keepNext/>
+              <w:jc w:val="center"/>
+            </w:pPr>
+            <w:r>
+              <w:rPr>
+                <w:rFonts w:ascii="Calibri" w:hAnsi="Calibri"/>
+                <w:sz w:val="20"/>
+              </w:rPr>
+              <w:t xml:space="default">0.004</w:t>
             </w:r>
           </w:p>
         </w:tc>
@@ -984,7 +1016,7 @@
                 <w:rFonts w:ascii="Calibri" w:hAnsi="Calibri"/>
                 <w:sz w:val="20"/>
               </w:rPr>
-              <w:t xml:space="default"/>
+              <w:t xml:space="default">—</w:t>
             </w:r>
           </w:p>
         </w:tc>
@@ -1080,7 +1112,7 @@
                 <w:rFonts w:ascii="Calibri" w:hAnsi="Calibri"/>
                 <w:sz w:val="20"/>
               </w:rPr>
-              <w:t xml:space="default"/>
+              <w:t xml:space="default">—</w:t>
             </w:r>
           </w:p>
         </w:tc>
@@ -1205,7 +1237,7 @@
                 <w:rFonts w:ascii="Calibri" w:hAnsi="Calibri"/>
                 <w:sz w:val="20"/>
               </w:rPr>
-              <w:t xml:space="default"/>
+              <w:t xml:space="default">—</w:t>
             </w:r>
           </w:p>
         </w:tc>
@@ -1301,7 +1333,7 @@
                 <w:rFonts w:ascii="Calibri" w:hAnsi="Calibri"/>
                 <w:sz w:val="20"/>
               </w:rPr>
-              <w:t xml:space="default"/>
+              <w:t xml:space="default">—</w:t>
             </w:r>
           </w:p>
         </w:tc>
@@ -1426,7 +1458,7 @@
                 <w:rFonts w:ascii="Calibri" w:hAnsi="Calibri"/>
                 <w:sz w:val="20"/>
               </w:rPr>
-              <w:t xml:space="default"/>
+              <w:t xml:space="default">—</w:t>
             </w:r>
           </w:p>
         </w:tc>
@@ -1522,7 +1554,7 @@
                 <w:rFonts w:ascii="Calibri" w:hAnsi="Calibri"/>
                 <w:sz w:val="20"/>
               </w:rPr>
-              <w:t xml:space="default"/>
+              <w:t xml:space="default">—</w:t>
             </w:r>
           </w:p>
         </w:tc>
@@ -1670,19 +1702,20 @@
               <w:start w:val="single" w:space="0" w:color="D3D3D3"/>
               <w:end w:val="single" w:space="0" w:color="D3D3D3"/>
             </w:tcBorders>
-          </w:tcPr>
-          <w:p>
-            <w:pPr>
-              <w:spacing w:before="0" w:after="60"/>
-              <w:keepNext/>
-              <w:jc w:val="center"/>
-            </w:pPr>
-            <w:r>
-              <w:rPr>
-                <w:rFonts w:ascii="Calibri" w:hAnsi="Calibri"/>
-                <w:sz w:val="20"/>
-              </w:rPr>
-              <w:t xml:space="default">**</w:t>
+            <w:shd w:val="clear" w:color="auto" w:fill="C8E6C9"/>
+          </w:tcPr>
+          <w:p>
+            <w:pPr>
+              <w:spacing w:before="0" w:after="60"/>
+              <w:keepNext/>
+              <w:jc w:val="center"/>
+            </w:pPr>
+            <w:r>
+              <w:rPr>
+                <w:rFonts w:ascii="Calibri" w:hAnsi="Calibri"/>
+                <w:sz w:val="20"/>
+              </w:rPr>
+              <w:t xml:space="default">0.005</w:t>
             </w:r>
           </w:p>
         </w:tc>
@@ -1767,19 +1800,20 @@
               <w:start w:val="single" w:space="0" w:color="D3D3D3"/>
               <w:end w:val="single" w:space="0" w:color="D3D3D3"/>
             </w:tcBorders>
-          </w:tcPr>
-          <w:p>
-            <w:pPr>
-              <w:spacing w:before="0" w:after="60"/>
-              <w:keepNext/>
-              <w:jc w:val="center"/>
-            </w:pPr>
-            <w:r>
-              <w:rPr>
-                <w:rFonts w:ascii="Calibri" w:hAnsi="Calibri"/>
-                <w:sz w:val="20"/>
-              </w:rPr>
-              <w:t xml:space="default">**</w:t>
+            <w:shd w:val="clear" w:color="auto" w:fill="C8E6C9"/>
+          </w:tcPr>
+          <w:p>
+            <w:pPr>
+              <w:spacing w:before="0" w:after="60"/>
+              <w:keepNext/>
+              <w:jc w:val="center"/>
+            </w:pPr>
+            <w:r>
+              <w:rPr>
+                <w:rFonts w:ascii="Calibri" w:hAnsi="Calibri"/>
+                <w:sz w:val="20"/>
+              </w:rPr>
+              <w:t xml:space="default">0.012</w:t>
             </w:r>
           </w:p>
         </w:tc>
@@ -2152,7 +2186,7 @@
                 <w:rFonts w:ascii="Calibri" w:hAnsi="Calibri"/>
                 <w:sz w:val="20"/>
               </w:rPr>
-              <w:t xml:space="default"/>
+              <w:t xml:space="default">—</w:t>
             </w:r>
           </w:p>
         </w:tc>
@@ -2249,7 +2283,7 @@
                 <w:rFonts w:ascii="Calibri" w:hAnsi="Calibri"/>
                 <w:sz w:val="20"/>
               </w:rPr>
-              <w:t xml:space="default">***</w:t>
+              <w:t xml:space="default">—</w:t>
             </w:r>
           </w:p>
         </w:tc>
@@ -2374,7 +2408,7 @@
                 <w:rFonts w:ascii="Calibri" w:hAnsi="Calibri"/>
                 <w:sz w:val="20"/>
               </w:rPr>
-              <w:t xml:space="default"/>
+              <w:t xml:space="default">—</w:t>
             </w:r>
           </w:p>
         </w:tc>
@@ -2471,7 +2505,7 @@
                 <w:rFonts w:ascii="Calibri" w:hAnsi="Calibri"/>
                 <w:sz w:val="20"/>
               </w:rPr>
-              <w:t xml:space="default">**</w:t>
+              <w:t xml:space="default">—</w:t>
             </w:r>
           </w:p>
         </w:tc>
@@ -2596,7 +2630,7 @@
                 <w:rFonts w:ascii="Calibri" w:hAnsi="Calibri"/>
                 <w:sz w:val="20"/>
               </w:rPr>
-              <w:t xml:space="default"/>
+              <w:t xml:space="default">—</w:t>
             </w:r>
           </w:p>
         </w:tc>
@@ -2692,7 +2726,7 @@
                 <w:rFonts w:ascii="Calibri" w:hAnsi="Calibri"/>
                 <w:sz w:val="20"/>
               </w:rPr>
-              <w:t xml:space="default"/>
+              <w:t xml:space="default">—</w:t>
             </w:r>
           </w:p>
         </w:tc>
@@ -2840,19 +2874,20 @@
               <w:start w:val="single" w:space="0" w:color="D3D3D3"/>
               <w:end w:val="single" w:space="0" w:color="D3D3D3"/>
             </w:tcBorders>
-          </w:tcPr>
-          <w:p>
-            <w:pPr>
-              <w:spacing w:before="0" w:after="60"/>
-              <w:keepNext/>
-              <w:jc w:val="center"/>
-            </w:pPr>
-            <w:r>
-              <w:rPr>
-                <w:rFonts w:ascii="Calibri" w:hAnsi="Calibri"/>
-                <w:sz w:val="20"/>
-              </w:rPr>
-              <w:t xml:space="default">*</w:t>
+            <w:shd w:val="clear" w:color="auto" w:fill="C8E6C9"/>
+          </w:tcPr>
+          <w:p>
+            <w:pPr>
+              <w:spacing w:before="0" w:after="60"/>
+              <w:keepNext/>
+              <w:jc w:val="center"/>
+            </w:pPr>
+            <w:r>
+              <w:rPr>
+                <w:rFonts w:ascii="Calibri" w:hAnsi="Calibri"/>
+                <w:sz w:val="20"/>
+              </w:rPr>
+              <w:t xml:space="default">0.031</w:t>
             </w:r>
           </w:p>
         </w:tc>
@@ -2948,7 +2983,7 @@
                 <w:rFonts w:ascii="Calibri" w:hAnsi="Calibri"/>
                 <w:sz w:val="20"/>
               </w:rPr>
-              <w:t xml:space="default"/>
+              <w:t xml:space="default">0.150</w:t>
             </w:r>
           </w:p>
         </w:tc>
@@ -3321,7 +3356,7 @@
                 <w:rFonts w:ascii="Calibri" w:hAnsi="Calibri"/>
                 <w:sz w:val="20"/>
               </w:rPr>
-              <w:t xml:space="default"/>
+              <w:t xml:space="default">—</w:t>
             </w:r>
           </w:p>
         </w:tc>
@@ -3418,7 +3453,7 @@
                 <w:rFonts w:ascii="Calibri" w:hAnsi="Calibri"/>
                 <w:sz w:val="20"/>
               </w:rPr>
-              <w:t xml:space="default">***</w:t>
+              <w:t xml:space="default">—</w:t>
             </w:r>
           </w:p>
         </w:tc>
@@ -3543,7 +3578,7 @@
                 <w:rFonts w:ascii="Calibri" w:hAnsi="Calibri"/>
                 <w:sz w:val="20"/>
               </w:rPr>
-              <w:t xml:space="default"/>
+              <w:t xml:space="default">—</w:t>
             </w:r>
           </w:p>
         </w:tc>
@@ -3639,7 +3674,7 @@
                 <w:rFonts w:ascii="Calibri" w:hAnsi="Calibri"/>
                 <w:sz w:val="20"/>
               </w:rPr>
-              <w:t xml:space="default"/>
+              <w:t xml:space="default">—</w:t>
             </w:r>
           </w:p>
         </w:tc>
@@ -3764,7 +3799,7 @@
                 <w:rFonts w:ascii="Calibri" w:hAnsi="Calibri"/>
                 <w:sz w:val="20"/>
               </w:rPr>
-              <w:t xml:space="default"/>
+              <w:t xml:space="default">—</w:t>
             </w:r>
           </w:p>
         </w:tc>
@@ -3860,7 +3895,7 @@
                 <w:rFonts w:ascii="Calibri" w:hAnsi="Calibri"/>
                 <w:sz w:val="20"/>
               </w:rPr>
-              <w:t xml:space="default"/>
+              <w:t xml:space="default">—</w:t>
             </w:r>
           </w:p>
         </w:tc>
@@ -4019,7 +4054,7 @@
                 <w:rFonts w:ascii="Calibri" w:hAnsi="Calibri"/>
                 <w:sz w:val="20"/>
               </w:rPr>
-              <w:t xml:space="default"/>
+              <w:t xml:space="default">0.247</w:t>
             </w:r>
           </w:p>
         </w:tc>
@@ -4116,7 +4151,7 @@
                 <w:rFonts w:ascii="Calibri" w:hAnsi="Calibri"/>
                 <w:sz w:val="20"/>
               </w:rPr>
-              <w:t xml:space="default">*</w:t>
+              <w:t xml:space="default">0.057</w:t>
             </w:r>
           </w:p>
         </w:tc>
@@ -4489,7 +4524,7 @@
                 <w:rFonts w:ascii="Calibri" w:hAnsi="Calibri"/>
                 <w:sz w:val="20"/>
               </w:rPr>
-              <w:t xml:space="default"/>
+              <w:t xml:space="default">—</w:t>
             </w:r>
           </w:p>
         </w:tc>
@@ -4586,7 +4621,7 @@
                 <w:rFonts w:ascii="Calibri" w:hAnsi="Calibri"/>
                 <w:sz w:val="20"/>
               </w:rPr>
-              <w:t xml:space="default">**</w:t>
+              <w:t xml:space="default">—</w:t>
             </w:r>
           </w:p>
         </w:tc>
@@ -4711,7 +4746,7 @@
                 <w:rFonts w:ascii="Calibri" w:hAnsi="Calibri"/>
                 <w:sz w:val="20"/>
               </w:rPr>
-              <w:t xml:space="default"/>
+              <w:t xml:space="default">—</w:t>
             </w:r>
           </w:p>
         </w:tc>
@@ -4807,7 +4842,7 @@
                 <w:rFonts w:ascii="Calibri" w:hAnsi="Calibri"/>
                 <w:sz w:val="20"/>
               </w:rPr>
-              <w:t xml:space="default"/>
+              <w:t xml:space="default">—</w:t>
             </w:r>
           </w:p>
         </w:tc>
@@ -4932,7 +4967,7 @@
                 <w:rFonts w:ascii="Calibri" w:hAnsi="Calibri"/>
                 <w:sz w:val="20"/>
               </w:rPr>
-              <w:t xml:space="default"/>
+              <w:t xml:space="default">—</w:t>
             </w:r>
           </w:p>
         </w:tc>
@@ -5028,7 +5063,7 @@
                 <w:rFonts w:ascii="Calibri" w:hAnsi="Calibri"/>
                 <w:sz w:val="20"/>
               </w:rPr>
-              <w:t xml:space="default"/>
+              <w:t xml:space="default">—</w:t>
             </w:r>
           </w:p>
         </w:tc>
@@ -5176,19 +5211,20 @@
               <w:start w:val="single" w:space="0" w:color="D3D3D3"/>
               <w:end w:val="single" w:space="0" w:color="D3D3D3"/>
             </w:tcBorders>
-          </w:tcPr>
-          <w:p>
-            <w:pPr>
-              <w:spacing w:before="0" w:after="60"/>
-              <w:keepNext/>
-              <w:jc w:val="center"/>
-            </w:pPr>
-            <w:r>
-              <w:rPr>
-                <w:rFonts w:ascii="Calibri" w:hAnsi="Calibri"/>
-                <w:sz w:val="20"/>
-              </w:rPr>
-              <w:t xml:space="default">***</w:t>
+            <w:shd w:val="clear" w:color="auto" w:fill="C8E6C9"/>
+          </w:tcPr>
+          <w:p>
+            <w:pPr>
+              <w:spacing w:before="0" w:after="60"/>
+              <w:keepNext/>
+              <w:jc w:val="center"/>
+            </w:pPr>
+            <w:r>
+              <w:rPr>
+                <w:rFonts w:ascii="Calibri" w:hAnsi="Calibri"/>
+                <w:sz w:val="20"/>
+              </w:rPr>
+              <w:t xml:space="default">&lt;0.001</w:t>
             </w:r>
           </w:p>
         </w:tc>
@@ -5273,19 +5309,20 @@
               <w:start w:val="single" w:space="0" w:color="D3D3D3"/>
               <w:end w:val="single" w:space="0" w:color="D3D3D3"/>
             </w:tcBorders>
-          </w:tcPr>
-          <w:p>
-            <w:pPr>
-              <w:spacing w:before="0" w:after="60"/>
-              <w:keepNext/>
-              <w:jc w:val="center"/>
-            </w:pPr>
-            <w:r>
-              <w:rPr>
-                <w:rFonts w:ascii="Calibri" w:hAnsi="Calibri"/>
-                <w:sz w:val="20"/>
-              </w:rPr>
-              <w:t xml:space="default">***</w:t>
+            <w:shd w:val="clear" w:color="auto" w:fill="C8E6C9"/>
+          </w:tcPr>
+          <w:p>
+            <w:pPr>
+              <w:spacing w:before="0" w:after="60"/>
+              <w:keepNext/>
+              <w:jc w:val="center"/>
+            </w:pPr>
+            <w:r>
+              <w:rPr>
+                <w:rFonts w:ascii="Calibri" w:hAnsi="Calibri"/>
+                <w:sz w:val="20"/>
+              </w:rPr>
+              <w:t xml:space="default">0.001</w:t>
             </w:r>
           </w:p>
         </w:tc>
@@ -5658,7 +5695,7 @@
                 <w:rFonts w:ascii="Calibri" w:hAnsi="Calibri"/>
                 <w:sz w:val="20"/>
               </w:rPr>
-              <w:t xml:space="default"/>
+              <w:t xml:space="default">—</w:t>
             </w:r>
           </w:p>
         </w:tc>
@@ -5755,7 +5792,7 @@
                 <w:rFonts w:ascii="Calibri" w:hAnsi="Calibri"/>
                 <w:sz w:val="20"/>
               </w:rPr>
-              <w:t xml:space="default">***</w:t>
+              <w:t xml:space="default">—</w:t>
             </w:r>
           </w:p>
         </w:tc>
@@ -5880,7 +5917,7 @@
                 <w:rFonts w:ascii="Calibri" w:hAnsi="Calibri"/>
                 <w:sz w:val="20"/>
               </w:rPr>
-              <w:t xml:space="default"/>
+              <w:t xml:space="default">—</w:t>
             </w:r>
           </w:p>
         </w:tc>
@@ -5977,7 +6014,7 @@
                 <w:rFonts w:ascii="Calibri" w:hAnsi="Calibri"/>
                 <w:sz w:val="20"/>
               </w:rPr>
-              <w:t xml:space="default">*</w:t>
+              <w:t xml:space="default">—</w:t>
             </w:r>
           </w:p>
         </w:tc>
@@ -6102,7 +6139,7 @@
                 <w:rFonts w:ascii="Calibri" w:hAnsi="Calibri"/>
                 <w:sz w:val="20"/>
               </w:rPr>
-              <w:t xml:space="default"/>
+              <w:t xml:space="default">—</w:t>
             </w:r>
           </w:p>
         </w:tc>
@@ -6198,7 +6235,7 @@
                 <w:rFonts w:ascii="Calibri" w:hAnsi="Calibri"/>
                 <w:sz w:val="20"/>
               </w:rPr>
-              <w:t xml:space="default"/>
+              <w:t xml:space="default">—</w:t>
             </w:r>
           </w:p>
         </w:tc>
@@ -6346,19 +6383,20 @@
               <w:start w:val="single" w:space="0" w:color="D3D3D3"/>
               <w:end w:val="single" w:space="0" w:color="D3D3D3"/>
             </w:tcBorders>
-          </w:tcPr>
-          <w:p>
-            <w:pPr>
-              <w:spacing w:before="0" w:after="60"/>
-              <w:keepNext/>
-              <w:jc w:val="center"/>
-            </w:pPr>
-            <w:r>
-              <w:rPr>
-                <w:rFonts w:ascii="Calibri" w:hAnsi="Calibri"/>
-                <w:sz w:val="20"/>
-              </w:rPr>
-              <w:t xml:space="default">***</w:t>
+            <w:shd w:val="clear" w:color="auto" w:fill="C8E6C9"/>
+          </w:tcPr>
+          <w:p>
+            <w:pPr>
+              <w:spacing w:before="0" w:after="60"/>
+              <w:keepNext/>
+              <w:jc w:val="center"/>
+            </w:pPr>
+            <w:r>
+              <w:rPr>
+                <w:rFonts w:ascii="Calibri" w:hAnsi="Calibri"/>
+                <w:sz w:val="20"/>
+              </w:rPr>
+              <w:t xml:space="default">&lt;0.001</w:t>
             </w:r>
           </w:p>
         </w:tc>
@@ -6443,19 +6481,20 @@
               <w:start w:val="single" w:space="0" w:color="D3D3D3"/>
               <w:end w:val="single" w:space="0" w:color="D3D3D3"/>
             </w:tcBorders>
-          </w:tcPr>
-          <w:p>
-            <w:pPr>
-              <w:spacing w:before="0" w:after="60"/>
-              <w:keepNext/>
-              <w:jc w:val="center"/>
-            </w:pPr>
-            <w:r>
-              <w:rPr>
-                <w:rFonts w:ascii="Calibri" w:hAnsi="Calibri"/>
-                <w:sz w:val="20"/>
-              </w:rPr>
-              <w:t xml:space="default">***</w:t>
+            <w:shd w:val="clear" w:color="auto" w:fill="C8E6C9"/>
+          </w:tcPr>
+          <w:p>
+            <w:pPr>
+              <w:spacing w:before="0" w:after="60"/>
+              <w:keepNext/>
+              <w:jc w:val="center"/>
+            </w:pPr>
+            <w:r>
+              <w:rPr>
+                <w:rFonts w:ascii="Calibri" w:hAnsi="Calibri"/>
+                <w:sz w:val="20"/>
+              </w:rPr>
+              <w:t xml:space="default">&lt;0.001</w:t>
             </w:r>
           </w:p>
         </w:tc>
@@ -6828,7 +6867,7 @@
                 <w:rFonts w:ascii="Calibri" w:hAnsi="Calibri"/>
                 <w:sz w:val="20"/>
               </w:rPr>
-              <w:t xml:space="default"/>
+              <w:t xml:space="default">—</w:t>
             </w:r>
           </w:p>
         </w:tc>
@@ -6924,7 +6963,7 @@
                 <w:rFonts w:ascii="Calibri" w:hAnsi="Calibri"/>
                 <w:sz w:val="20"/>
               </w:rPr>
-              <w:t xml:space="default"/>
+              <w:t xml:space="default">—</w:t>
             </w:r>
           </w:p>
         </w:tc>
@@ -7049,7 +7088,7 @@
                 <w:rFonts w:ascii="Calibri" w:hAnsi="Calibri"/>
                 <w:sz w:val="20"/>
               </w:rPr>
-              <w:t xml:space="default"/>
+              <w:t xml:space="default">—</w:t>
             </w:r>
           </w:p>
         </w:tc>
@@ -7146,7 +7185,7 @@
                 <w:rFonts w:ascii="Calibri" w:hAnsi="Calibri"/>
                 <w:sz w:val="20"/>
               </w:rPr>
-              <w:t xml:space="default">*</w:t>
+              <w:t xml:space="default">—</w:t>
             </w:r>
           </w:p>
         </w:tc>
@@ -7271,7 +7310,7 @@
                 <w:rFonts w:ascii="Calibri" w:hAnsi="Calibri"/>
                 <w:sz w:val="20"/>
               </w:rPr>
-              <w:t xml:space="default"/>
+              <w:t xml:space="default">—</w:t>
             </w:r>
           </w:p>
         </w:tc>
@@ -7367,7 +7406,7 @@
                 <w:rFonts w:ascii="Calibri" w:hAnsi="Calibri"/>
                 <w:sz w:val="20"/>
               </w:rPr>
-              <w:t xml:space="default"/>
+              <w:t xml:space="default">—</w:t>
             </w:r>
           </w:p>
         </w:tc>
@@ -7399,7 +7438,7 @@
                 <w:rFonts w:ascii="Calibri" w:hAnsi="Calibri"/>
                 <w:sz w:val="20"/>
               </w:rPr>
-              <w:t xml:space="default">*** p&lt;0.001; ** p&lt;0.01; * p&lt;0.05. β = change in biomarker per 1-unit increase in composite risk score. Highlighted cells indicate p&lt;0.05. — = not applicable (CogDrisk not adjusted for these covariates).</w:t>
+              <w:t xml:space="default">p: unadjusted; q: Benjamini-Hochberg FDR-adjusted. β = change in biomarker per 1-unit increase in composite risk score. Light green: p&lt;0.05; dark green: q&lt;0.05. — = not applicable (CogDrisk not adjusted for these covariates).</w:t>
             </w:r>
           </w:p>
         </w:tc>

</xml_diff>